<commit_message>
Uploaded project plan, ideation document and changed website layout
</commit_message>
<xml_diff>
--- a/Documents/Ideation document .docx
+++ b/Documents/Ideation document .docx
@@ -2000,28 +2000,29 @@
     </w:p>
     <w:p/>
     <w:p/>
-    <w:p/>
-    <w:p/>
-    <w:p/>
-    <w:p/>
-    <w:p/>
-    <w:p/>
-    <w:p/>
-    <w:p/>
     <w:p>
       <w:pPr>
         <w:pStyle w:val="Heading1"/>
-      </w:pPr>
-    </w:p>
-    <w:p>
-      <w:pPr>
-        <w:pStyle w:val="Heading1"/>
+        <w:ind w:left="0" w:firstLine="0"/>
       </w:pPr>
       <w:r>
         <w:t>Flowcharts</w:t>
       </w:r>
     </w:p>
-    <w:p/>
+    <w:p>
+      <w:pPr>
+        <w:ind w:left="0" w:firstLine="0"/>
+        <w:rPr>
+          <w:rStyle w:val="Strong"/>
+        </w:rPr>
+      </w:pPr>
+      <w:r>
+        <w:rPr>
+          <w:rStyle w:val="Strong"/>
+        </w:rPr>
+        <w:t>Reservation process</w:t>
+      </w:r>
+    </w:p>
     <w:p>
       <w:pPr>
         <w:rPr>
@@ -2033,20 +2034,19 @@
           <w:rStyle w:val="Strong"/>
           <w:noProof/>
         </w:rPr>
-        <w:lastRenderedPageBreak/>
         <w:drawing>
-          <wp:anchor distT="0" distB="0" distL="114300" distR="114300" simplePos="0" relativeHeight="251658240" behindDoc="0" locked="0" layoutInCell="1" allowOverlap="1" wp14:anchorId="136A82B8" wp14:editId="139D50D7">
+          <wp:anchor distT="0" distB="0" distL="114300" distR="114300" simplePos="0" relativeHeight="251668480" behindDoc="0" locked="0" layoutInCell="1" allowOverlap="1" wp14:anchorId="7A901836" wp14:editId="5E308EE3">
             <wp:simplePos x="0" y="0"/>
             <wp:positionH relativeFrom="column">
-              <wp:posOffset>-6350</wp:posOffset>
+              <wp:posOffset>0</wp:posOffset>
             </wp:positionH>
             <wp:positionV relativeFrom="paragraph">
-              <wp:posOffset>265793</wp:posOffset>
+              <wp:posOffset>112892</wp:posOffset>
             </wp:positionV>
-            <wp:extent cx="2254250" cy="6340475"/>
-            <wp:effectExtent l="0" t="0" r="0" b="3175"/>
-            <wp:wrapTopAndBottom/>
-            <wp:docPr id="138609189" name="Picture 6"/>
+            <wp:extent cx="2326463" cy="7323013"/>
+            <wp:effectExtent l="0" t="0" r="0" b="0"/>
+            <wp:wrapNone/>
+            <wp:docPr id="610888499" name="Picture 2" descr="A screenshot of a computer&#10;&#10;Description automatically generated"/>
             <wp:cNvGraphicFramePr>
               <a:graphicFrameLocks xmlns:a="http://schemas.openxmlformats.org/drawingml/2006/main" noChangeAspect="1"/>
             </wp:cNvGraphicFramePr>
@@ -2054,7 +2054,7 @@
               <a:graphicData uri="http://schemas.openxmlformats.org/drawingml/2006/picture">
                 <pic:pic xmlns:pic="http://schemas.openxmlformats.org/drawingml/2006/picture">
                   <pic:nvPicPr>
-                    <pic:cNvPr id="0" name="Picture 4"/>
+                    <pic:cNvPr id="610888499" name="Picture 2" descr="A screenshot of a computer&#10;&#10;Description automatically generated"/>
                     <pic:cNvPicPr>
                       <a:picLocks noChangeAspect="1" noChangeArrowheads="1"/>
                     </pic:cNvPicPr>
@@ -2075,7 +2075,7 @@
                   <pic:spPr bwMode="auto">
                     <a:xfrm>
                       <a:off x="0" y="0"/>
-                      <a:ext cx="2254250" cy="6340475"/>
+                      <a:ext cx="2327307" cy="7325670"/>
                     </a:xfrm>
                     <a:prstGeom prst="rect">
                       <a:avLst/>
@@ -2097,12 +2097,20 @@
           </wp:anchor>
         </w:drawing>
       </w:r>
-      <w:r>
+    </w:p>
+    <w:p>
+      <w:pPr>
         <w:rPr>
           <w:rStyle w:val="Strong"/>
         </w:rPr>
-        <w:t>Reservation process</w:t>
-      </w:r>
+      </w:pPr>
+    </w:p>
+    <w:p>
+      <w:pPr>
+        <w:rPr>
+          <w:rStyle w:val="Strong"/>
+        </w:rPr>
+      </w:pPr>
     </w:p>
     <w:p>
       <w:pPr>

</xml_diff>